<commit_message>
Add conflicting regeneration-guidance source to task_8 per reviewer feedback
Reviewer feedback (4/5) asked for more analytical judgment via conflicting
evidence sources, stronger trade-off analysis, and decisions under
uncertainty. Adds one new input file, Regeneration_Guidance_Bulletin.pdf, a
generic trade-association note quoting a higher blanket regeneration ceiling
than this lot's own screening data supports, and updates the prompt, both
GTF files, and rubric criteria 13/25 to require reconciling the two sources
without leaking the answer. All existing prompt content, computed values,
and other rubric criteria are unchanged.

Co-Authored-By: Claude Sonnet 5 <noreply@anthropic.com>
Claude-Session: https://claude.ai/code/session_01YatK3uaTmrq3Hf8SWGtwYM
</commit_message>
<xml_diff>
--- a/task_8/gtf_files/Adsorbent_Cost_Comparison.docx
+++ b/task_8/gtf_files/Adsorbent_Cost_Comparison.docx
@@ -869,6 +869,12 @@
         </w:rPr>
         <w:t>On the released-product basis, CTSAgn is about 10% more efficient than biochar; under the waste-burden case, the comparison reverses and it is about 23.5% less efficient. Progress to controlled pilot validation rather than bank an unconditional cost advantage. The recovered composite reaches the defined 5% post-150 °C mass-loss threshold at about 195 °C under the nitrogen ramp, leaving roughly 20 °C above the benchmark's assumed 175 °C regeneration temperature. This is a screening threshold, not proof of intactness or of capacity retention through three regeneration cycles; verify process losses and cycle performance before an adoption commitment.</w:t>
       </w:r>
+      <w:r>
+        <w:rPr>
+          <w:sz w:val="20"/>
+        </w:rPr>
+        <w:t xml:space="preserve"> A trade-association practice note in circulation quotes a considerably higher blanket regeneration ceiling for this class of media, but that figure is an aggregate never measured on this lot; until validated against this composite, the 195 °C reading above remains the basis for confidence in the handling ceiling and the stage-gate call.</w:t>
+      </w:r>
     </w:p>
     <w:sectPr>
       <w:pgSz w:w="12240" w:h="15840"/>

</xml_diff>